<commit_message>
Add public repository link to research paper
</commit_message>
<xml_diff>
--- a/docs/SpillFlow_Final_Research_Paper.docx
+++ b/docs/SpillFlow_Final_Research_Paper.docx
@@ -3928,7 +3928,31 @@
     </w:p>
     <w:p>
       <w:r>
-        <w:t>For a public archival release, the repository URL, immutable commit hash, machine specification, raw per-trial result files, and a license for the benchmark data should be added to the paper metadata. The current package version is 0.1.0-alpha.1 under the MIT license.</w:t>
+        <w:t xml:space="preserve">The public MIT-licensed source repository is available at </w:t>
+      </w:r>
+      <w:hyperlink r:id="rId14">
+        <w:r>
+          <w:rPr>
+            <w:color w:val="0563C1"/>
+            <w:u w:val="single"/>
+          </w:rPr>
+          <w:t>https://github.com/abkore83/SpillFlow</w:t>
+        </w:r>
+      </w:hyperlink>
+      <w:r>
+        <w:t xml:space="preserve">. The evaluated source is preserved at commit </w:t>
+      </w:r>
+      <w:hyperlink r:id="rId15">
+        <w:r>
+          <w:rPr>
+            <w:color w:val="0563C1"/>
+            <w:u w:val="single"/>
+          </w:rPr>
+          <w:t>cc2007c4c99f8a8374a4686bd8d21a1536a8f4e2</w:t>
+        </w:r>
+      </w:hyperlink>
+      <w:r>
+        <w:t>. The current package version is 0.1.0-alpha.1. Future publication-quality runs should also preserve machine specifications and raw per-trial result files.</w:t>
       </w:r>
     </w:p>
     <w:p>
@@ -3978,13 +4002,19 @@
     </w:p>
     <w:p>
       <w:r>
-        <w:rPr>
-          <w:b/>
-        </w:rPr>
-        <w:t xml:space="preserve">Code and data availability: </w:t>
+        <w:t xml:space="preserve">Code and data availability: Source code, benchmark harnesses, automated tests, package artifacts, and detailed benchmark results are publicly available under the MIT license at </w:t>
       </w:r>
+      <w:hyperlink r:id="rId14">
+        <w:r>
+          <w:rPr>
+            <w:color w:val="0563C1"/>
+            <w:u w:val="single"/>
+          </w:rPr>
+          <w:t>https://github.com/abkore83/SpillFlow</w:t>
+        </w:r>
+      </w:hyperlink>
       <w:r>
-        <w:t>The source code, benchmark harness, automated tests, package artifacts, and detailed benchmark result file are retained by the author and are available on reasonable request. A public archival repository with an immutable release tag is planned.</w:t>
+        <w:t>. The version evaluated in this paper is commit cc2007c4c99f8a8374a4686bd8d21a1536a8f4e2.</w:t>
       </w:r>
     </w:p>
     <w:p>

</xml_diff>